<commit_message>
Add coauthor and update public availability statements
</commit_message>
<xml_diff>
--- a/submission/jpi/JPI_Anonymized_Manuscript.docx
+++ b/submission/jpi/JPI_Anonymized_Manuscript.docx
@@ -6283,7 +6283,7 @@
     </w:p>
     <w:p>
       <w:r>
-        <w:t>The source dataset is publicly available through the CAMELYON17-WILDS benchmark and the Hugging Face dataset mirror identified in the Methods. The study did not redistribute source histopathology images. Analysis code, configuration files, frozen protocol records, and non-image derived result tables are available from the corresponding author on reasonable request, subject to the original dataset terms and repository-size constraints.</w:t>
+        <w:t>The source dataset is publicly available through the CAMELYON17-WILDS benchmark and the dataset mirror identified in the Methods. Source histopathology images were not redistributed. Aggregate result tables, non-image figures, protocol documentation, and reproducibility materials are available in a public repository. The identifying repository address is withheld from the blinded manuscript and is provided separately to the editorial office.</w:t>
       </w:r>
     </w:p>
     <w:p>
@@ -6296,7 +6296,7 @@
     </w:p>
     <w:p>
       <w:r>
-        <w:t>The analysis code, configurations, evaluation guards, and manuscript-generation scripts are available from the corresponding author on reasonable request. A sanitized public archival release is planned, excluding source images, credentials, environment-specific cache files, and files restricted by source-dataset terms.</w:t>
+        <w:t>Source code, configurations, guarded evaluation scripts, manuscript-generation scripts, and reproducibility documentation are available in a public repository. The identifying repository address is withheld from the blinded manuscript and is provided separately to the editorial office. Source images, trained checkpoints, raw patch-level predictions, authorization records, run sentinels, credentials, and environment-specific caches are excluded.</w:t>
       </w:r>
     </w:p>
     <w:p>
@@ -6348,7 +6348,7 @@
     </w:p>
     <w:p>
       <w:r>
-        <w:t>The author declares that there are no competing financial or personal interests that could have influenced the work reported in this article.</w:t>
+        <w:t>The authors declare that they have no known competing financial interests or personal relationships that could have influenced the work reported in this article.</w:t>
       </w:r>
     </w:p>
     <w:p>
@@ -6361,7 +6361,7 @@
     </w:p>
     <w:p>
       <w:r>
-        <w:t>During the preparation of this work, the author used OpenAI ChatGPT and Codex and Anthropic Claude Code to support code drafting, workflow documentation, literature-search assistance, citation verification, content organization, and language refinement. All experimental decisions, code execution, source verification, statistical results, scientific interpretation, and manuscript revisions were reviewed and validated by the author. The author edited the generated material as necessary and takes full responsibility for the content of the article. No generative AI or AI-assisted image-generation tool was used to create or alter scientific figures, images, data, or experimental results.</w:t>
+        <w:t>During preparation of this work, the corresponding author used OpenAI ChatGPT and Codex and Anthropic Claude Code to support code drafting, workflow documentation, literature-search assistance, citation verification, content organization, and language refinement. All experimental decisions, code execution, source verification, statistical results, scientific interpretation, and manuscript revisions were reviewed and validated by the corresponding author. Both authors reviewed and approved the final manuscript and this disclosure. No generative AI or AI-assisted image-generation tool was used to create or alter scientific figures, images, data, or experimental results.</w:t>
       </w:r>
     </w:p>
     <w:p>

</xml_diff>

<commit_message>
Revise manuscript title and add methodology workflow figure
</commit_message>
<xml_diff>
--- a/submission/jpi/JPI_Anonymized_Manuscript.docx
+++ b/submission/jpi/JPI_Anonymized_Manuscript.docx
@@ -8,7 +8,7 @@
         <w:jc w:val="center"/>
       </w:pPr>
       <w:r>
-        <w:t>When Development Gains Do Not Transfer: Confidence-Aware Tumor Detection Under Reserved-Hospital Shift</w:t>
+        <w:t>Hospital Domain Shift Can Reverse Development Gains in Histopathology Tumor Detection: A Reserved-Center Study of Calibration and Operating-Point Transfer</w:t>
       </w:r>
     </w:p>
     <w:p>
@@ -162,6 +162,11 @@
     <w:p>
       <w:r>
         <w:t>Center 1 was used for development comparison and calibration and was never treated as final performance. Center 2 remained unread until the model pair and all reporting policies were frozen. No random split, cap, sample, or silent truncation was applied to the full development or final evaluations.</w:t>
+      </w:r>
+    </w:p>
+    <w:p>
+      <w:r>
+        <w:t>The complete locked development and reserved-center evaluation workflow is summarized in Figure 1.</w:t>
       </w:r>
     </w:p>
     <w:p>
@@ -769,6 +774,67 @@
       </w:r>
     </w:p>
     <w:p>
+      <w:r>
+        <w:br w:type="page"/>
+      </w:r>
+    </w:p>
+    <w:p>
+      <w:pPr>
+        <w:keepNext/>
+        <w:jc w:val="center"/>
+      </w:pPr>
+      <w:r>
+        <w:drawing>
+          <wp:inline xmlns:a="http://schemas.openxmlformats.org/drawingml/2006/main" xmlns:pic="http://schemas.openxmlformats.org/drawingml/2006/picture">
+            <wp:extent cx="5806440" cy="3931797"/>
+            <wp:docPr id="1" name="Picture 1"/>
+            <wp:cNvGraphicFramePr>
+              <a:graphicFrameLocks noChangeAspect="1"/>
+            </wp:cNvGraphicFramePr>
+            <a:graphic>
+              <a:graphicData uri="http://schemas.openxmlformats.org/drawingml/2006/picture">
+                <pic:pic>
+                  <pic:nvPicPr>
+                    <pic:cNvPr id="0" name="figure_methodology_workflow.png"/>
+                    <pic:cNvPicPr/>
+                  </pic:nvPicPr>
+                  <pic:blipFill>
+                    <a:blip r:embed="rId10"/>
+                    <a:stretch>
+                      <a:fillRect/>
+                    </a:stretch>
+                  </pic:blipFill>
+                  <pic:spPr>
+                    <a:xfrm>
+                      <a:off x="0" y="0"/>
+                      <a:ext cx="5806440" cy="3931797"/>
+                    </a:xfrm>
+                    <a:prstGeom prst="rect"/>
+                  </pic:spPr>
+                </pic:pic>
+              </a:graphicData>
+            </a:graphic>
+          </wp:inline>
+        </w:drawing>
+      </w:r>
+    </w:p>
+    <w:p>
+      <w:pPr>
+        <w:keepLines/>
+        <w:spacing w:after="160"/>
+        <w:jc w:val="both"/>
+      </w:pPr>
+      <w:r>
+        <w:rPr>
+          <w:b/>
+        </w:rPr>
+        <w:t xml:space="preserve">Figure 1. </w:t>
+      </w:r>
+      <w:r>
+        <w:t>Locked multi-hospital development and reserved-center evaluation workflow. CAMELYON17-WILDS centers 0, 3, and 4 supplied center-stratified training and in-distribution validation data. Center 1 was used for out-of-distribution development comparison and temperature fitting. Model checkpoints, roles, calibration temperatures, candidate operating thresholds, metrics, output schemas, and the one-run limit were frozen before center 2 was accessed. The reserved center-2 dataset was instantiated once and traversed once while the predeclared GroupDRO primary candidate and matched ERM control were evaluated in the same batch loop. Final analyses covered discrimination, calibration, operating-point transport, and high-confidence false negatives. No center-2 calibration refitting, threshold tuning, checkpoint replacement, post-test model selection, or repeat evaluation was permitted.</w:t>
+      </w:r>
+    </w:p>
+    <w:p>
       <w:pPr>
         <w:pStyle w:val="Heading2"/>
       </w:pPr>
@@ -979,7 +1045,7 @@
     </w:p>
     <w:p>
       <w:r>
-        <w:t>Development and final discrimination are summarized in Table 2 and Figure 1.</w:t>
+        <w:t>Development and final discrimination are summarized in Table 2 and Figure 2.</w:t>
       </w:r>
     </w:p>
     <w:p>
@@ -2566,7 +2632,7 @@
     </w:p>
     <w:p>
       <w:r>
-        <w:t>Final default-threshold metrics are summarized in Table 3 and Figure 2.</w:t>
+        <w:t>Final default-threshold metrics are summarized in Table 3 and Figure 3.</w:t>
       </w:r>
     </w:p>
     <w:p>
@@ -3411,7 +3477,7 @@
     </w:p>
     <w:p>
       <w:r>
-        <w:t>The predeclared AUROC reversal is displayed in Figure 3.</w:t>
+        <w:t>The predeclared AUROC reversal is displayed in Figure 4.</w:t>
       </w:r>
     </w:p>
     <w:p>
@@ -3434,7 +3500,7 @@
     </w:p>
     <w:p>
       <w:r>
-        <w:t>Raw and calibrated reliability metrics are summarized in Table 4 and Figure 4.</w:t>
+        <w:t>Raw and calibrated reliability metrics are summarized in Table 4 and Figure 5.</w:t>
       </w:r>
     </w:p>
     <w:p>
@@ -4273,7 +4339,7 @@
     </w:p>
     <w:p>
       <w:r>
-        <w:t>Transfer of the 14 frozen candidate/non-clinical operating points is shown in Figure 5 and detailed in Supplementary Table S3.</w:t>
+        <w:t>Transfer of the 14 frozen candidate/non-clinical operating points is shown in Figure 6 and detailed in Supplementary Table S3.</w:t>
       </w:r>
     </w:p>
     <w:p>
@@ -4301,7 +4367,7 @@
     </w:p>
     <w:p>
       <w:r>
-        <w:t>Counts are summarized in Table 5 and Figure 6.</w:t>
+        <w:t>Counts are summarized in Table 5 and Figure 7.</w:t>
       </w:r>
     </w:p>
     <w:p>

</xml_diff>